<commit_message>
docs: ampliar entregable Word y agregar link del demo en Vercel
Word (estima 4-5 páginas, dentro del límite):
- Portada: enlace al demo en Vercel además del repositorio.
- §7 Aplicativo web: descripción de los cinco paneles del dashboard
  (Resultados, Cargar caso, Benchmark, Pruebas, Documentación).
- §8 Suite de pruebas: lista de los 10 escenarios validados con CI.
- §9 Decisiones de diseño: interpretación de favoriteCategory,
  QuickSort vs MergeSort en cada implementación, parser sin split.

README:
- Encabezado y sección Despliegue ahora muestran la URL pública
  tarea-final-e-dy-a1.vercel.app/app/index.html.
</commit_message>
<xml_diff>
--- a/docs/Tarea_Final_EDyA1_Entregable.docx
+++ b/docs/Tarea_Final_EDyA1_Entregable.docx
@@ -410,6 +410,23 @@
           <w:i/>
         </w:rPr>
         <w:t>github.com/jorgeeduquinones-boop/TareaFinal_EDyA1</w:t>
+      </w:r>
+    </w:p>
+    <w:p>
+      <w:pPr>
+        <w:jc w:val="center"/>
+      </w:pPr>
+      <w:r>
+        <w:rPr>
+          <w:b/>
+        </w:rPr>
+        <w:t xml:space="preserve">Demo en vivo: </w:t>
+      </w:r>
+      <w:r>
+        <w:rPr>
+          <w:i/>
+        </w:rPr>
+        <w:t>https://tarea-final-e-dy-a1.vercel.app/app/index.html</w:t>
       </w:r>
     </w:p>
     <w:p>
@@ -1516,6 +1533,243 @@
         <w:t>3) Customer2 300 Clothing</w:t>
       </w:r>
     </w:p>
+    <w:p>
+      <w:pPr>
+        <w:spacing w:before="200" w:after="80"/>
+        <w:jc w:val="left"/>
+      </w:pPr>
+      <w:r>
+        <w:rPr>
+          <w:b/>
+          <w:sz w:val="26"/>
+        </w:rPr>
+        <w:t>7. Aplicativo web entregado</w:t>
+      </w:r>
+    </w:p>
+    <w:p>
+      <w:pPr>
+        <w:spacing w:after="120"/>
+      </w:pPr>
+      <w:r>
+        <w:rPr>
+          <w:b w:val="0"/>
+          <w:i w:val="0"/>
+          <w:sz w:val="22"/>
+        </w:rPr>
+        <w:t>Además del entregable académico en TareaFinal_EDyA1/, el proyecto incluye una aplicación web (PWA) desplegada en Vercel y accesible desde https://tarea-final-e-dy-a1.vercel.app/app/index.html. La app organiza la solución en cinco paneles: Resultados muestra el ranking obtenido por calcularPedidos junto con métricas y gráficos; Cargar caso permite pegar texto, subir un CSV o generar un caso sintético reproducible con (m, n, p, seed); Benchmark contrasta empíricamente MergeSort, QuickSort 3-way, RadixSort, Insertion Sort y Array.sort nativo sobre el mismo dataset; Pruebas ejecuta la suite automatizada; y Documentación reúne el análisis de complejidad y las decisiones de diseño.</w:t>
+      </w:r>
+    </w:p>
+    <w:p>
+      <w:pPr>
+        <w:spacing w:before="80" w:after="80"/>
+        <w:jc w:val="left"/>
+      </w:pPr>
+      <w:r>
+        <w:rPr>
+          <w:b/>
+          <w:sz w:val="26"/>
+        </w:rPr>
+        <w:t>8. Suite de pruebas automatizada</w:t>
+      </w:r>
+    </w:p>
+    <w:p>
+      <w:pPr>
+        <w:spacing w:after="40"/>
+      </w:pPr>
+      <w:r>
+        <w:rPr>
+          <w:b w:val="0"/>
+          <w:i w:val="0"/>
+          <w:sz w:val="22"/>
+        </w:rPr>
+        <w:t>El archivo app/js/tests.js corre tanto en Node (node app/js/tests.js) como en la pestaña Pruebas del dashboard, y valida diez escenarios:</w:t>
+      </w:r>
+    </w:p>
+    <w:p>
+      <w:pPr>
+        <w:pStyle w:val="ListNumber"/>
+        <w:spacing w:after="0"/>
+      </w:pPr>
+      <w:r>
+        <w:rPr>
+          <w:sz w:val="21"/>
+        </w:rPr>
+        <w:t>Ejemplo exacto del enunciado.</w:t>
+      </w:r>
+    </w:p>
+    <w:p>
+      <w:pPr>
+        <w:pStyle w:val="ListNumber"/>
+        <w:spacing w:after="0"/>
+      </w:pPr>
+      <w:r>
+        <w:rPr>
+          <w:sz w:val="21"/>
+        </w:rPr>
+        <w:t>Empate en totalSpent → desempate por favoriteCategory descendente.</w:t>
+      </w:r>
+    </w:p>
+    <w:p>
+      <w:pPr>
+        <w:pStyle w:val="ListNumber"/>
+        <w:spacing w:after="0"/>
+      </w:pPr>
+      <w:r>
+        <w:rPr>
+          <w:sz w:val="21"/>
+        </w:rPr>
+        <w:t>Empate doble → desempate por customer ascendente.</w:t>
+      </w:r>
+    </w:p>
+    <w:p>
+      <w:pPr>
+        <w:pStyle w:val="ListNumber"/>
+        <w:spacing w:after="0"/>
+      </w:pPr>
+      <w:r>
+        <w:rPr>
+          <w:sz w:val="21"/>
+        </w:rPr>
+        <w:t>Acumulación correcta de price · quantity.</w:t>
+      </w:r>
+    </w:p>
+    <w:p>
+      <w:pPr>
+        <w:pStyle w:val="ListNumber"/>
+        <w:spacing w:after="0"/>
+      </w:pPr>
+      <w:r>
+        <w:rPr>
+          <w:sz w:val="21"/>
+        </w:rPr>
+        <w:t>favoriteCategory equivale a la categoría con más transacciones.</w:t>
+      </w:r>
+    </w:p>
+    <w:p>
+      <w:pPr>
+        <w:pStyle w:val="ListNumber"/>
+        <w:spacing w:after="0"/>
+      </w:pPr>
+      <w:r>
+        <w:rPr>
+          <w:sz w:val="21"/>
+        </w:rPr>
+        <w:t>Tolerancia a espacios extra y a ‘;’ final.</w:t>
+      </w:r>
+    </w:p>
+    <w:p>
+      <w:pPr>
+        <w:pStyle w:val="ListNumber"/>
+        <w:spacing w:after="0"/>
+      </w:pPr>
+      <w:r>
+        <w:rPr>
+          <w:sz w:val="21"/>
+        </w:rPr>
+        <w:t>Records mal formados se ignoran sin lanzar excepción.</w:t>
+      </w:r>
+    </w:p>
+    <w:p>
+      <w:pPr>
+        <w:pStyle w:val="ListNumber"/>
+        <w:spacing w:after="0"/>
+      </w:pPr>
+      <w:r>
+        <w:rPr>
+          <w:sz w:val="21"/>
+        </w:rPr>
+        <w:t>String vacío produce salida vacía.</w:t>
+      </w:r>
+    </w:p>
+    <w:p>
+      <w:pPr>
+        <w:pStyle w:val="ListNumber"/>
+        <w:spacing w:after="0"/>
+      </w:pPr>
+      <w:r>
+        <w:rPr>
+          <w:sz w:val="21"/>
+        </w:rPr>
+        <w:t>Volumen alto: 10 000 records procesados sin desbordar la pila.</w:t>
+      </w:r>
+    </w:p>
+    <w:p>
+      <w:pPr>
+        <w:pStyle w:val="ListNumber"/>
+        <w:spacing w:after="0"/>
+      </w:pPr>
+      <w:r>
+        <w:rPr>
+          <w:sz w:val="21"/>
+        </w:rPr>
+        <w:t>Estabilidad: orden determinístico ante empates totales.</w:t>
+      </w:r>
+    </w:p>
+    <w:p>
+      <w:pPr>
+        <w:spacing w:after="120"/>
+      </w:pPr>
+      <w:r>
+        <w:rPr>
+          <w:b w:val="0"/>
+          <w:i w:val="0"/>
+          <w:sz w:val="22"/>
+        </w:rPr>
+        <w:t>Resultado actual: 10/10 pruebas pasan. La integración continua (.github/workflows/deploy-pages.yml) las ejecuta antes de cada despliegue, garantizando que sólo versiones verificadas llegan a producción.</w:t>
+      </w:r>
+    </w:p>
+    <w:p>
+      <w:pPr>
+        <w:spacing w:before="80" w:after="80"/>
+        <w:jc w:val="left"/>
+      </w:pPr>
+      <w:r>
+        <w:rPr>
+          <w:b/>
+          <w:sz w:val="26"/>
+        </w:rPr>
+        <w:t>9. Decisiones de diseño relevantes</w:t>
+      </w:r>
+    </w:p>
+    <w:p>
+      <w:pPr>
+        <w:spacing w:after="80"/>
+      </w:pPr>
+      <w:r>
+        <w:rPr>
+          <w:b w:val="0"/>
+          <w:i w:val="0"/>
+          <w:sz w:val="22"/>
+        </w:rPr>
+        <w:t>Interpretación de favoriteCategory. Se eligió la categoría con mayor número de transacciones (un record = una compra), no la suma de quantity ni del gasto. En el ejemplo del enunciado las tres interpretaciones coinciden, pero ésta es la más simple de defender y la única que respeta literalmente el texto ‘en la que más compras realizó’. Empates por frecuencia se rompen escogiendo la categoría lexicográficamente mayor, consistente con el criterio 2 del orden global.</w:t>
+      </w:r>
+    </w:p>
+    <w:p>
+      <w:pPr>
+        <w:spacing w:after="80"/>
+      </w:pPr>
+      <w:r>
+        <w:rPr>
+          <w:b w:val="0"/>
+          <w:i w:val="0"/>
+          <w:sz w:val="22"/>
+        </w:rPr>
+        <w:t>QuickSort frente a MergeSort. El entregable académico usa QuickSort recursivo siguiendo el esquema particion_por_Nombre de la Práctica 5, con mediana de tres, cambio a Insertion Sort en particiones pequeñas (umbral 16) y recursión optimizada en cola para mantener la pila en O(log n). El dashboard usa MergeSort bottom-up estable para garantizar O(n log n) en el peor caso y permitir comparación multi-criterio sin desempates secundarios. Ambas variantes resuelven el mismo enunciado y producen idéntica salida.</w:t>
+      </w:r>
+    </w:p>
+    <w:p>
+      <w:pPr>
+        <w:spacing w:after="40"/>
+      </w:pPr>
+      <w:r>
+        <w:rPr>
+          <w:b w:val="0"/>
+          <w:i w:val="0"/>
+          <w:sz w:val="22"/>
+        </w:rPr>
+        <w:t>Parser carácter a carácter. Evita el doble split tradicional que genera del orden de 7·m strings intermedios y presión de recolección de basura. El scan es O(L) donde L = m·k, con asignaciones mínimas.</w:t>
+      </w:r>
+    </w:p>
     <w:sectPr>
       <w:pgSz w:w="12240" w:h="15840"/>
       <w:pgMar w:top="1134" w:right="1247" w:bottom="1134" w:left="1247" w:header="720" w:footer="720" w:gutter="0"/>

</xml_diff>

<commit_message>
docs(word): agregar tabla de variables, diagrama de flujo y walkthrough
Tres añadidos para que el documento se entienda mejor sin perder
brevedad (estima 4-5 páginas, dentro del límite):

§1.1 Variables y notación
- Tabla con m, n, p, k y L con su significado en una sola línea cada
  una, antes del pseudocódigo.

§1.2 Flujo de la función
- Diagrama en una línea con las cinco etapas encadenadas
  (parser → acumulación → favoriteCategory → quickSort → formateo)
  para que se vea de un vistazo cómo se compone la solución.

§6 Verificación con el ejemplo del enunciado
- Tabla walkthrough mostrando el estado de los datos al terminar
  cada etapa sobre el caso del PDF. Permite al lector seguir
  paso a paso cómo se llega del input a la salida sin tener que
  ejecutar el código.
</commit_message>
<xml_diff>
--- a/docs/Tarea_Final_EDyA1_Entregable.docx
+++ b/docs/Tarea_Final_EDyA1_Entregable.docx
@@ -449,7 +449,7 @@
     </w:p>
     <w:p>
       <w:pPr>
-        <w:spacing w:after="200"/>
+        <w:spacing w:after="160"/>
       </w:pPr>
       <w:r>
         <w:rPr>
@@ -458,6 +458,216 @@
           <w:sz w:val="22"/>
         </w:rPr>
         <w:t>Dado un caso compuesto por m records de compras (m ≥ 5) separados por punto y coma, donde cada record tiene el formato “customer product category price quantity timestamp”, se debe implementar la función calcularPedidos(caso) en util.js que retorne una cadena con n líneas (n ≥ 3, una por cliente distinto) en el formato “[a]) customer [totalSpent] [favoriteCategory]”. El ranking se ordena por tres criterios: (1) totalSpent — suma de price·quantity — descendente, (2) favoriteCategory — categoría con más transacciones por cliente — descendente, y (3) customer ascendente como desempate final. La solución debe usar algoritmos vistos en clase (Prácticas 4, 5 y 6) y procesar eficientemente entradas con alto volumen, conservando los términos n, m y p.</w:t>
+      </w:r>
+    </w:p>
+    <w:p>
+      <w:pPr>
+        <w:spacing w:before="80" w:after="60"/>
+        <w:jc w:val="left"/>
+      </w:pPr>
+      <w:r>
+        <w:rPr>
+          <w:b/>
+          <w:sz w:val="24"/>
+        </w:rPr>
+        <w:t>1.1 Variables y notación</w:t>
+      </w:r>
+    </w:p>
+    <w:tbl>
+      <w:tblPr>
+        <w:tblStyle w:val="LightGrid-Accent1"/>
+        <w:tblW w:type="auto" w:w="0"/>
+        <w:tblLayout w:type="fixed"/>
+        <w:tblLook w:firstColumn="1" w:firstRow="1" w:lastColumn="0" w:lastRow="0" w:noHBand="0" w:noVBand="1" w:val="04A0"/>
+      </w:tblPr>
+      <w:tblGrid>
+        <w:gridCol w:w="1701"/>
+        <w:gridCol w:w="7540"/>
+      </w:tblGrid>
+      <w:tr>
+        <w:tc>
+          <w:tcPr>
+            <w:tcW w:type="dxa" w:w="4873"/>
+          </w:tcPr>
+          <w:p>
+            <w:r>
+              <w:rPr>
+                <w:rFonts w:ascii="Consolas" w:hAnsi="Consolas"/>
+                <w:b/>
+              </w:rPr>
+              <w:t>m</w:t>
+            </w:r>
+          </w:p>
+        </w:tc>
+        <w:tc>
+          <w:tcPr>
+            <w:tcW w:type="dxa" w:w="4873"/>
+          </w:tcPr>
+          <w:p>
+            <w:r>
+              <w:rPr>
+                <w:sz w:val="21"/>
+              </w:rPr>
+              <w:t>Número de records de la entrada (m ≥ 5).</w:t>
+            </w:r>
+          </w:p>
+        </w:tc>
+      </w:tr>
+      <w:tr>
+        <w:tc>
+          <w:tcPr>
+            <w:tcW w:type="dxa" w:w="4873"/>
+          </w:tcPr>
+          <w:p>
+            <w:r>
+              <w:rPr>
+                <w:rFonts w:ascii="Consolas" w:hAnsi="Consolas"/>
+                <w:b/>
+              </w:rPr>
+              <w:t>n</w:t>
+            </w:r>
+          </w:p>
+        </w:tc>
+        <w:tc>
+          <w:tcPr>
+            <w:tcW w:type="dxa" w:w="4873"/>
+          </w:tcPr>
+          <w:p>
+            <w:r>
+              <w:rPr>
+                <w:sz w:val="21"/>
+              </w:rPr>
+              <w:t>Número de clientes únicos en el ranking final (n ≥ 3).</w:t>
+            </w:r>
+          </w:p>
+        </w:tc>
+      </w:tr>
+      <w:tr>
+        <w:tc>
+          <w:tcPr>
+            <w:tcW w:type="dxa" w:w="4873"/>
+          </w:tcPr>
+          <w:p>
+            <w:r>
+              <w:rPr>
+                <w:rFonts w:ascii="Consolas" w:hAnsi="Consolas"/>
+                <w:b/>
+              </w:rPr>
+              <w:t>p</w:t>
+            </w:r>
+          </w:p>
+        </w:tc>
+        <w:tc>
+          <w:tcPr>
+            <w:tcW w:type="dxa" w:w="4873"/>
+          </w:tcPr>
+          <w:p>
+            <w:r>
+              <w:rPr>
+                <w:sz w:val="21"/>
+              </w:rPr>
+              <w:t>Número de categorías distintas con las que opera el caso.</w:t>
+            </w:r>
+          </w:p>
+        </w:tc>
+      </w:tr>
+      <w:tr>
+        <w:tc>
+          <w:tcPr>
+            <w:tcW w:type="dxa" w:w="4873"/>
+          </w:tcPr>
+          <w:p>
+            <w:r>
+              <w:rPr>
+                <w:rFonts w:ascii="Consolas" w:hAnsi="Consolas"/>
+                <w:b/>
+              </w:rPr>
+              <w:t>k</w:t>
+            </w:r>
+          </w:p>
+        </w:tc>
+        <w:tc>
+          <w:tcPr>
+            <w:tcW w:type="dxa" w:w="4873"/>
+          </w:tcPr>
+          <w:p>
+            <w:r>
+              <w:rPr>
+                <w:sz w:val="21"/>
+              </w:rPr>
+              <w:t>Longitud media de un campo string (acotada en la práctica).</w:t>
+            </w:r>
+          </w:p>
+        </w:tc>
+      </w:tr>
+      <w:tr>
+        <w:tc>
+          <w:tcPr>
+            <w:tcW w:type="dxa" w:w="4873"/>
+          </w:tcPr>
+          <w:p>
+            <w:r>
+              <w:rPr>
+                <w:rFonts w:ascii="Consolas" w:hAnsi="Consolas"/>
+                <w:b/>
+              </w:rPr>
+              <w:t>L</w:t>
+            </w:r>
+          </w:p>
+        </w:tc>
+        <w:tc>
+          <w:tcPr>
+            <w:tcW w:type="dxa" w:w="4873"/>
+          </w:tcPr>
+          <w:p>
+            <w:r>
+              <w:rPr>
+                <w:sz w:val="21"/>
+              </w:rPr>
+              <w:t>Longitud total del string de entrada ≈ m · k.</w:t>
+            </w:r>
+          </w:p>
+        </w:tc>
+      </w:tr>
+    </w:tbl>
+    <w:p>
+      <w:pPr>
+        <w:spacing w:before="160" w:after="60"/>
+        <w:jc w:val="left"/>
+      </w:pPr>
+      <w:r>
+        <w:rPr>
+          <w:b/>
+          <w:sz w:val="24"/>
+        </w:rPr>
+        <w:t>1.2 Flujo de la función</w:t>
+      </w:r>
+    </w:p>
+    <w:p>
+      <w:pPr>
+        <w:spacing w:after="80"/>
+      </w:pPr>
+      <w:r>
+        <w:rPr>
+          <w:b w:val="0"/>
+          <w:i w:val="0"/>
+          <w:sz w:val="22"/>
+        </w:rPr>
+        <w:t>calcularPedidos procesa la entrada en cinco etapas encadenadas. Cada etapa toma la salida de la anterior y deja la entrada lista para la siguiente, lo que permite analizar la complejidad por fragmento.</w:t>
+      </w:r>
+    </w:p>
+    <w:p>
+      <w:pPr>
+        <w:spacing w:after="200"/>
+        <w:jc w:val="center"/>
+      </w:pPr>
+      <w:r>
+        <w:rPr>
+          <w:rFonts w:ascii="Consolas" w:hAnsi="Consolas"/>
+          <w:b/>
+          <w:sz w:val="20"/>
+        </w:rPr>
+        <w:t>caso  →  [1] Parser  →  [2] Acumulación por cliente  →  [3] favoriteCategory  →  [4] QuickSort  →  [5] Formateo  →  salida</w:t>
       </w:r>
     </w:p>
     <w:p>
@@ -1506,6 +1716,205 @@
     </w:p>
     <w:p>
       <w:pPr>
+        <w:spacing w:after="80"/>
+      </w:pPr>
+      <w:r>
+        <w:rPr>
+          <w:b w:val="0"/>
+          <w:i w:val="0"/>
+          <w:sz w:val="22"/>
+        </w:rPr>
+        <w:t>Caso de entrada: "Customer1 Laptop Technology 3000 1 10;Customer2 Shirt Clothing 50 2 12;Customer1 Mouse Technology 100 1 15;Customer2 Shoes Clothing 200 1 20;Customer3 TV Technology 2500 1 25". A continuación el estado de los datos al final de cada etapa:</w:t>
+      </w:r>
+    </w:p>
+    <w:tbl>
+      <w:tblPr>
+        <w:tblStyle w:val="LightGrid-Accent1"/>
+        <w:tblW w:type="auto" w:w="0"/>
+        <w:tblLayout w:type="fixed"/>
+        <w:tblLook w:firstColumn="1" w:firstRow="1" w:lastColumn="0" w:lastRow="0" w:noHBand="0" w:noVBand="1" w:val="04A0"/>
+      </w:tblPr>
+      <w:tblGrid>
+        <w:gridCol w:w="2268"/>
+        <w:gridCol w:w="6973"/>
+      </w:tblGrid>
+      <w:tr>
+        <w:tc>
+          <w:tcPr>
+            <w:tcW w:type="dxa" w:w="4873"/>
+          </w:tcPr>
+          <w:p>
+            <w:r>
+              <w:rPr>
+                <w:b/>
+                <w:sz w:val="21"/>
+              </w:rPr>
+              <w:t>Etapa</w:t>
+            </w:r>
+          </w:p>
+        </w:tc>
+        <w:tc>
+          <w:tcPr>
+            <w:tcW w:type="dxa" w:w="4873"/>
+          </w:tcPr>
+          <w:p>
+            <w:r>
+              <w:rPr>
+                <w:sz w:val="21"/>
+              </w:rPr>
+              <w:t>Resultado al terminar</w:t>
+            </w:r>
+          </w:p>
+        </w:tc>
+      </w:tr>
+      <w:tr>
+        <w:tc>
+          <w:tcPr>
+            <w:tcW w:type="dxa" w:w="4873"/>
+          </w:tcPr>
+          <w:p>
+            <w:r>
+              <w:rPr>
+                <w:b/>
+                <w:sz w:val="21"/>
+              </w:rPr>
+              <w:t>1. Parser</w:t>
+            </w:r>
+          </w:p>
+        </w:tc>
+        <w:tc>
+          <w:tcPr>
+            <w:tcW w:type="dxa" w:w="4873"/>
+          </w:tcPr>
+          <w:p>
+            <w:r>
+              <w:rPr>
+                <w:sz w:val="20"/>
+              </w:rPr>
+              <w:t>5 records normalizados: [{Customer1,Laptop,Technology,3000,1,10}, {Customer2,Shirt,Clothing,50,2,12}, {Customer1,Mouse,Technology,100,1,15}, {Customer2,Shoes,Clothing,200,1,20}, {Customer3,TV,Technology,2500,1,25}].</w:t>
+            </w:r>
+          </w:p>
+        </w:tc>
+      </w:tr>
+      <w:tr>
+        <w:tc>
+          <w:tcPr>
+            <w:tcW w:type="dxa" w:w="4873"/>
+          </w:tcPr>
+          <w:p>
+            <w:r>
+              <w:rPr>
+                <w:b/>
+                <w:sz w:val="21"/>
+              </w:rPr>
+              <w:t>2. Acumulación</w:t>
+            </w:r>
+          </w:p>
+        </w:tc>
+        <w:tc>
+          <w:tcPr>
+            <w:tcW w:type="dxa" w:w="4873"/>
+          </w:tcPr>
+          <w:p>
+            <w:r>
+              <w:rPr>
+                <w:sz w:val="20"/>
+              </w:rPr>
+              <w:t>Customer1 → 3100, cats {Technology:2}; Customer2 → 300, cats {Clothing:2}; Customer3 → 2500, cats {Technology:1}.</w:t>
+            </w:r>
+          </w:p>
+        </w:tc>
+      </w:tr>
+      <w:tr>
+        <w:tc>
+          <w:tcPr>
+            <w:tcW w:type="dxa" w:w="4873"/>
+          </w:tcPr>
+          <w:p>
+            <w:r>
+              <w:rPr>
+                <w:b/>
+                <w:sz w:val="21"/>
+              </w:rPr>
+              <w:t>3. favoriteCategory</w:t>
+            </w:r>
+          </w:p>
+        </w:tc>
+        <w:tc>
+          <w:tcPr>
+            <w:tcW w:type="dxa" w:w="4873"/>
+          </w:tcPr>
+          <w:p>
+            <w:r>
+              <w:rPr>
+                <w:sz w:val="20"/>
+              </w:rPr>
+              <w:t>Customer1 → Technology; Customer2 → Clothing; Customer3 → Technology.</w:t>
+            </w:r>
+          </w:p>
+        </w:tc>
+      </w:tr>
+      <w:tr>
+        <w:tc>
+          <w:tcPr>
+            <w:tcW w:type="dxa" w:w="4873"/>
+          </w:tcPr>
+          <w:p>
+            <w:r>
+              <w:rPr>
+                <w:b/>
+                <w:sz w:val="21"/>
+              </w:rPr>
+              <w:t>4. QuickSort</w:t>
+            </w:r>
+          </w:p>
+        </w:tc>
+        <w:tc>
+          <w:tcPr>
+            <w:tcW w:type="dxa" w:w="4873"/>
+          </w:tcPr>
+          <w:p>
+            <w:r>
+              <w:rPr>
+                <w:sz w:val="20"/>
+              </w:rPr>
+              <w:t>Orden por (totalSpent ↓, favoriteCategory ↓, customer ↑): [Customer1 3100 Technology, Customer3 2500 Technology, Customer2 300 Clothing].</w:t>
+            </w:r>
+          </w:p>
+        </w:tc>
+      </w:tr>
+      <w:tr>
+        <w:tc>
+          <w:tcPr>
+            <w:tcW w:type="dxa" w:w="4873"/>
+          </w:tcPr>
+          <w:p>
+            <w:r>
+              <w:rPr>
+                <w:b/>
+                <w:sz w:val="21"/>
+              </w:rPr>
+              <w:t>5. Formateo</w:t>
+            </w:r>
+          </w:p>
+        </w:tc>
+        <w:tc>
+          <w:tcPr>
+            <w:tcW w:type="dxa" w:w="4873"/>
+          </w:tcPr>
+          <w:p>
+            <w:r>
+              <w:rPr>
+                <w:sz w:val="20"/>
+              </w:rPr>
+              <w:t>'1) Customer1 3100 Technology\n2) Customer3 2500 Technology\n3) Customer2 300 Clothing'.</w:t>
+            </w:r>
+          </w:p>
+        </w:tc>
+      </w:tr>
+    </w:tbl>
+    <w:p>
+      <w:pPr>
         <w:spacing w:after="40"/>
       </w:pPr>
       <w:r>
@@ -1514,7 +1923,7 @@
           <w:i w:val="0"/>
           <w:sz w:val="22"/>
         </w:rPr>
-        <w:t>Para el caso "Customer1 Laptop Technology 3000 1 10;Customer2 Shirt Clothing 50 2 12;Customer1 Mouse Technology 100 1 15;Customer2 Shoes Clothing 200 1 20;Customer3 TV Technology 2500 1 25", la función retorna:</w:t>
+        <w:t>Salida final retornada por calcularPedidos:</w:t>
       </w:r>
     </w:p>
     <w:p>

</xml_diff>